<commit_message>
Update ATA inputs and contract template file
</commit_message>
<xml_diff>
--- a/modules/contratos/data/modelo_contrato_ps.docx
+++ b/modules/contratos/data/modelo_contrato_ps.docx
@@ -25,12 +25,12 @@
             <wp:extent cx="7610475" cy="10765571"/>
             <wp:effectExtent b="0" l="0" r="0" t="0"/>
             <wp:wrapNone/>
-            <wp:docPr id="4" name="image2.png"/>
+            <wp:docPr id="4" name="image1.png"/>
             <a:graphic>
               <a:graphicData uri="http://schemas.openxmlformats.org/drawingml/2006/picture">
                 <pic:pic>
                   <pic:nvPicPr>
-                    <pic:cNvPr id="0" name="image2.png"/>
+                    <pic:cNvPr id="0" name="image1.png"/>
                     <pic:cNvPicPr preferRelativeResize="0"/>
                   </pic:nvPicPr>
                   <pic:blipFill>
@@ -462,7 +462,6 @@
           <w:bCs w:val="1"/>
           <w:sz w:val="24"/>
           <w:szCs w:val="24"/>
-          <w:highlight w:val="yellow"/>
           <w:rtl w:val="0"/>
         </w:rPr>
         <w:t xml:space="preserve">{{ atual_presidente }}</w:t>
@@ -517,7 +516,6 @@
           <w:rFonts w:ascii="Montserrat" w:cs="Montserrat" w:eastAsia="Montserrat" w:hAnsi="Montserrat"/>
           <w:sz w:val="24"/>
           <w:szCs w:val="24"/>
-          <w:highlight w:val="yellow"/>
           <w:rtl w:val="0"/>
         </w:rPr>
         <w:t xml:space="preserve">{{ cpf_presidente }}</w:t>
@@ -577,7 +575,6 @@
           <w:color w:val="ff0000"/>
           <w:sz w:val="24"/>
           <w:szCs w:val="24"/>
-          <w:highlight w:val="yellow"/>
         </w:rPr>
       </w:pPr>
       <w:r>
@@ -613,7 +610,6 @@
           <w:bCs w:val="1"/>
           <w:sz w:val="24"/>
           <w:szCs w:val="24"/>
-          <w:highlight w:val="yellow"/>
           <w:rtl w:val="0"/>
         </w:rPr>
         <w:t xml:space="preserve">{{ nome_pj }}</w:t>
@@ -632,7 +628,6 @@
           <w:rFonts w:ascii="Montserrat" w:cs="Montserrat" w:eastAsia="Montserrat" w:hAnsi="Montserrat"/>
           <w:sz w:val="24"/>
           <w:szCs w:val="24"/>
-          <w:highlight w:val="yellow"/>
           <w:rtl w:val="0"/>
         </w:rPr>
         <w:t xml:space="preserve">{{ cnpj }}</w:t>
@@ -651,7 +646,6 @@
           <w:rFonts w:ascii="Montserrat" w:cs="Montserrat" w:eastAsia="Montserrat" w:hAnsi="Montserrat"/>
           <w:sz w:val="24"/>
           <w:szCs w:val="24"/>
-          <w:highlight w:val="yellow"/>
           <w:rtl w:val="0"/>
         </w:rPr>
         <w:t xml:space="preserve">{{ rua_pj }}</w:t>
@@ -670,7 +664,6 @@
           <w:rFonts w:ascii="Montserrat" w:cs="Montserrat" w:eastAsia="Montserrat" w:hAnsi="Montserrat"/>
           <w:sz w:val="24"/>
           <w:szCs w:val="24"/>
-          <w:highlight w:val="yellow"/>
           <w:rtl w:val="0"/>
         </w:rPr>
         <w:t xml:space="preserve">{{ numero_pj }}</w:t>
@@ -689,7 +682,6 @@
           <w:rFonts w:ascii="Montserrat" w:cs="Montserrat" w:eastAsia="Montserrat" w:hAnsi="Montserrat"/>
           <w:sz w:val="24"/>
           <w:szCs w:val="24"/>
-          <w:highlight w:val="yellow"/>
           <w:rtl w:val="0"/>
         </w:rPr>
         <w:t xml:space="preserve">{{ complemento_pj }}</w:t>
@@ -708,7 +700,6 @@
           <w:rFonts w:ascii="Montserrat" w:cs="Montserrat" w:eastAsia="Montserrat" w:hAnsi="Montserrat"/>
           <w:sz w:val="24"/>
           <w:szCs w:val="24"/>
-          <w:highlight w:val="yellow"/>
           <w:rtl w:val="0"/>
         </w:rPr>
         <w:t xml:space="preserve">{{ bairro_pj}}</w:t>
@@ -727,7 +718,6 @@
           <w:rFonts w:ascii="Montserrat" w:cs="Montserrat" w:eastAsia="Montserrat" w:hAnsi="Montserrat"/>
           <w:sz w:val="24"/>
           <w:szCs w:val="24"/>
-          <w:highlight w:val="yellow"/>
           <w:rtl w:val="0"/>
         </w:rPr>
         <w:t xml:space="preserve">{{ cep_pj }}</w:t>
@@ -746,7 +736,6 @@
           <w:rFonts w:ascii="Montserrat" w:cs="Montserrat" w:eastAsia="Montserrat" w:hAnsi="Montserrat"/>
           <w:sz w:val="24"/>
           <w:szCs w:val="24"/>
-          <w:highlight w:val="yellow"/>
           <w:rtl w:val="0"/>
         </w:rPr>
         <w:t xml:space="preserve">{{ cidade_pj }}</w:t>
@@ -765,19 +754,9 @@
           <w:rFonts w:ascii="Montserrat" w:cs="Montserrat" w:eastAsia="Montserrat" w:hAnsi="Montserrat"/>
           <w:sz w:val="24"/>
           <w:szCs w:val="24"/>
-          <w:highlight w:val="yellow"/>
-          <w:rtl w:val="0"/>
-        </w:rPr>
-        <w:t xml:space="preserve">{{ estado_pj }}</w:t>
-      </w:r>
-      <w:r>
-        <w:rPr>
-          <w:rFonts w:ascii="Montserrat" w:cs="Montserrat" w:eastAsia="Montserrat" w:hAnsi="Montserrat"/>
-          <w:sz w:val="24"/>
-          <w:szCs w:val="24"/>
-          <w:rtl w:val="0"/>
-        </w:rPr>
-        <w:t xml:space="preserve">.</w:t>
+          <w:rtl w:val="0"/>
+        </w:rPr>
+        <w:t xml:space="preserve">{{ estado_pj }}.</w:t>
       </w:r>
       <w:r>
         <w:rPr>
@@ -793,7 +772,6 @@
           <w:rFonts w:ascii="Montserrat" w:cs="Montserrat" w:eastAsia="Montserrat" w:hAnsi="Montserrat"/>
           <w:sz w:val="24"/>
           <w:szCs w:val="24"/>
-          <w:highlight w:val="yellow"/>
           <w:rtl w:val="0"/>
         </w:rPr>
         <w:t xml:space="preserve">{{ cargo_rep }}</w:t>
@@ -814,7 +792,6 @@
           <w:bCs w:val="1"/>
           <w:sz w:val="24"/>
           <w:szCs w:val="24"/>
-          <w:highlight w:val="yellow"/>
           <w:rtl w:val="0"/>
         </w:rPr>
         <w:t xml:space="preserve">{{ nome_rep }}</w:t>
@@ -833,7 +810,6 @@
           <w:rFonts w:ascii="Montserrat" w:cs="Montserrat" w:eastAsia="Montserrat" w:hAnsi="Montserrat"/>
           <w:sz w:val="24"/>
           <w:szCs w:val="24"/>
-          <w:highlight w:val="yellow"/>
           <w:rtl w:val="0"/>
         </w:rPr>
         <w:t xml:space="preserve">{{ nacionalidade_rep }}</w:t>
@@ -852,7 +828,6 @@
           <w:rFonts w:ascii="Montserrat" w:cs="Montserrat" w:eastAsia="Montserrat" w:hAnsi="Montserrat"/>
           <w:sz w:val="24"/>
           <w:szCs w:val="24"/>
-          <w:highlight w:val="yellow"/>
           <w:rtl w:val="0"/>
         </w:rPr>
         <w:t xml:space="preserve">{{ cpf_rep }}</w:t>
@@ -871,7 +846,6 @@
           <w:rFonts w:ascii="Montserrat" w:cs="Montserrat" w:eastAsia="Montserrat" w:hAnsi="Montserrat"/>
           <w:sz w:val="24"/>
           <w:szCs w:val="24"/>
-          <w:highlight w:val="yellow"/>
           <w:rtl w:val="0"/>
         </w:rPr>
         <w:t xml:space="preserve">{{ email_rep }}</w:t>
@@ -890,7 +864,6 @@
           <w:rFonts w:ascii="Montserrat" w:cs="Montserrat" w:eastAsia="Montserrat" w:hAnsi="Montserrat"/>
           <w:sz w:val="24"/>
           <w:szCs w:val="24"/>
-          <w:highlight w:val="yellow"/>
           <w:rtl w:val="0"/>
         </w:rPr>
         <w:t xml:space="preserve">{{ rua_rep }}</w:t>
@@ -909,7 +882,6 @@
           <w:rFonts w:ascii="Montserrat" w:cs="Montserrat" w:eastAsia="Montserrat" w:hAnsi="Montserrat"/>
           <w:sz w:val="24"/>
           <w:szCs w:val="24"/>
-          <w:highlight w:val="yellow"/>
           <w:rtl w:val="0"/>
         </w:rPr>
         <w:t xml:space="preserve">{{ numero_rep }}</w:t>
@@ -928,7 +900,6 @@
           <w:rFonts w:ascii="Montserrat" w:cs="Montserrat" w:eastAsia="Montserrat" w:hAnsi="Montserrat"/>
           <w:sz w:val="24"/>
           <w:szCs w:val="24"/>
-          <w:highlight w:val="yellow"/>
           <w:rtl w:val="0"/>
         </w:rPr>
         <w:t xml:space="preserve">{{ complemento_rep }}</w:t>
@@ -947,7 +918,6 @@
           <w:rFonts w:ascii="Montserrat" w:cs="Montserrat" w:eastAsia="Montserrat" w:hAnsi="Montserrat"/>
           <w:sz w:val="24"/>
           <w:szCs w:val="24"/>
-          <w:highlight w:val="yellow"/>
           <w:rtl w:val="0"/>
         </w:rPr>
         <w:t xml:space="preserve">{{ bairro_rep }}</w:t>
@@ -966,7 +936,6 @@
           <w:rFonts w:ascii="Montserrat" w:cs="Montserrat" w:eastAsia="Montserrat" w:hAnsi="Montserrat"/>
           <w:sz w:val="24"/>
           <w:szCs w:val="24"/>
-          <w:highlight w:val="yellow"/>
           <w:rtl w:val="0"/>
         </w:rPr>
         <w:t xml:space="preserve">{{ cep_rep }}</w:t>
@@ -985,7 +954,6 @@
           <w:rFonts w:ascii="Montserrat" w:cs="Montserrat" w:eastAsia="Montserrat" w:hAnsi="Montserrat"/>
           <w:sz w:val="24"/>
           <w:szCs w:val="24"/>
-          <w:highlight w:val="yellow"/>
           <w:rtl w:val="0"/>
         </w:rPr>
         <w:t xml:space="preserve">{{ cidade_rep }}</w:t>
@@ -1004,7 +972,6 @@
           <w:rFonts w:ascii="Montserrat" w:cs="Montserrat" w:eastAsia="Montserrat" w:hAnsi="Montserrat"/>
           <w:sz w:val="24"/>
           <w:szCs w:val="24"/>
-          <w:highlight w:val="yellow"/>
           <w:rtl w:val="0"/>
         </w:rPr>
         <w:t xml:space="preserve">{{ estado_rep }}</w:t>
@@ -1062,7 +1029,6 @@
           <w:bCs w:val="1"/>
           <w:sz w:val="24"/>
           <w:szCs w:val="24"/>
-          <w:highlight w:val="yellow"/>
           <w:rtl w:val="0"/>
         </w:rPr>
         <w:t xml:space="preserve">{{ nome_rep }}</w:t>
@@ -1081,7 +1047,6 @@
           <w:rFonts w:ascii="Montserrat" w:cs="Montserrat" w:eastAsia="Montserrat" w:hAnsi="Montserrat"/>
           <w:sz w:val="24"/>
           <w:szCs w:val="24"/>
-          <w:highlight w:val="yellow"/>
           <w:rtl w:val="0"/>
         </w:rPr>
         <w:t xml:space="preserve">{{ nacionalidade_rep }}</w:t>
@@ -1100,7 +1065,6 @@
           <w:rFonts w:ascii="Montserrat" w:cs="Montserrat" w:eastAsia="Montserrat" w:hAnsi="Montserrat"/>
           <w:sz w:val="24"/>
           <w:szCs w:val="24"/>
-          <w:highlight w:val="yellow"/>
           <w:rtl w:val="0"/>
         </w:rPr>
         <w:t xml:space="preserve">{{ estado_civil_rep }}</w:t>
@@ -1119,7 +1083,6 @@
           <w:rFonts w:ascii="Montserrat" w:cs="Montserrat" w:eastAsia="Montserrat" w:hAnsi="Montserrat"/>
           <w:sz w:val="24"/>
           <w:szCs w:val="24"/>
-          <w:highlight w:val="yellow"/>
           <w:rtl w:val="0"/>
         </w:rPr>
         <w:t xml:space="preserve">{{ profissao_rep }}</w:t>
@@ -1138,7 +1101,6 @@
           <w:rFonts w:ascii="Montserrat" w:cs="Montserrat" w:eastAsia="Montserrat" w:hAnsi="Montserrat"/>
           <w:sz w:val="24"/>
           <w:szCs w:val="24"/>
-          <w:highlight w:val="yellow"/>
           <w:rtl w:val="0"/>
         </w:rPr>
         <w:t xml:space="preserve">{{ cpf_rep }}</w:t>
@@ -1157,7 +1119,6 @@
           <w:rFonts w:ascii="Montserrat" w:cs="Montserrat" w:eastAsia="Montserrat" w:hAnsi="Montserrat"/>
           <w:sz w:val="24"/>
           <w:szCs w:val="24"/>
-          <w:highlight w:val="yellow"/>
           <w:rtl w:val="0"/>
         </w:rPr>
         <w:t xml:space="preserve">(( rg_rep }}</w:t>
@@ -1176,7 +1137,6 @@
           <w:rFonts w:ascii="Montserrat" w:cs="Montserrat" w:eastAsia="Montserrat" w:hAnsi="Montserrat"/>
           <w:sz w:val="24"/>
           <w:szCs w:val="24"/>
-          <w:highlight w:val="yellow"/>
           <w:rtl w:val="0"/>
         </w:rPr>
         <w:t xml:space="preserve">{{ email_rep }}</w:t>
@@ -1195,7 +1155,6 @@
           <w:rFonts w:ascii="Montserrat" w:cs="Montserrat" w:eastAsia="Montserrat" w:hAnsi="Montserrat"/>
           <w:sz w:val="24"/>
           <w:szCs w:val="24"/>
-          <w:highlight w:val="yellow"/>
           <w:rtl w:val="0"/>
         </w:rPr>
         <w:t xml:space="preserve">{{ rua_rep }}</w:t>
@@ -1214,114 +1173,9 @@
           <w:rFonts w:ascii="Montserrat" w:cs="Montserrat" w:eastAsia="Montserrat" w:hAnsi="Montserrat"/>
           <w:sz w:val="24"/>
           <w:szCs w:val="24"/>
-          <w:highlight w:val="yellow"/>
-          <w:rtl w:val="0"/>
-        </w:rPr>
-        <w:t xml:space="preserve">{{ numero_rep }}</w:t>
-      </w:r>
-      <w:r>
-        <w:rPr>
-          <w:rFonts w:ascii="Montserrat" w:cs="Montserrat" w:eastAsia="Montserrat" w:hAnsi="Montserrat"/>
-          <w:sz w:val="24"/>
-          <w:szCs w:val="24"/>
-          <w:rtl w:val="0"/>
-        </w:rPr>
-        <w:t xml:space="preserve">, </w:t>
-      </w:r>
-      <w:r>
-        <w:rPr>
-          <w:rFonts w:ascii="Montserrat" w:cs="Montserrat" w:eastAsia="Montserrat" w:hAnsi="Montserrat"/>
-          <w:sz w:val="24"/>
-          <w:szCs w:val="24"/>
-          <w:highlight w:val="yellow"/>
-          <w:rtl w:val="0"/>
-        </w:rPr>
-        <w:t xml:space="preserve">{{ complemento_rep }}</w:t>
-      </w:r>
-      <w:r>
-        <w:rPr>
-          <w:rFonts w:ascii="Montserrat" w:cs="Montserrat" w:eastAsia="Montserrat" w:hAnsi="Montserrat"/>
-          <w:sz w:val="24"/>
-          <w:szCs w:val="24"/>
-          <w:rtl w:val="0"/>
-        </w:rPr>
-        <w:t xml:space="preserve"> - </w:t>
-      </w:r>
-      <w:r>
-        <w:rPr>
-          <w:rFonts w:ascii="Montserrat" w:cs="Montserrat" w:eastAsia="Montserrat" w:hAnsi="Montserrat"/>
-          <w:sz w:val="24"/>
-          <w:szCs w:val="24"/>
-          <w:highlight w:val="yellow"/>
-          <w:rtl w:val="0"/>
-        </w:rPr>
-        <w:t xml:space="preserve">{{ bairro_rep }}</w:t>
-      </w:r>
-      <w:r>
-        <w:rPr>
-          <w:rFonts w:ascii="Montserrat" w:cs="Montserrat" w:eastAsia="Montserrat" w:hAnsi="Montserrat"/>
-          <w:sz w:val="24"/>
-          <w:szCs w:val="24"/>
-          <w:rtl w:val="0"/>
-        </w:rPr>
-        <w:t xml:space="preserve">. CEP: </w:t>
-      </w:r>
-      <w:r>
-        <w:rPr>
-          <w:rFonts w:ascii="Montserrat" w:cs="Montserrat" w:eastAsia="Montserrat" w:hAnsi="Montserrat"/>
-          <w:sz w:val="24"/>
-          <w:szCs w:val="24"/>
-          <w:highlight w:val="yellow"/>
-          <w:rtl w:val="0"/>
-        </w:rPr>
-        <w:t xml:space="preserve">{{ cep_rep }}</w:t>
-      </w:r>
-      <w:r>
-        <w:rPr>
-          <w:rFonts w:ascii="Montserrat" w:cs="Montserrat" w:eastAsia="Montserrat" w:hAnsi="Montserrat"/>
-          <w:sz w:val="24"/>
-          <w:szCs w:val="24"/>
-          <w:rtl w:val="0"/>
-        </w:rPr>
-        <w:t xml:space="preserve">.  </w:t>
-      </w:r>
-      <w:r>
-        <w:rPr>
-          <w:rFonts w:ascii="Montserrat" w:cs="Montserrat" w:eastAsia="Montserrat" w:hAnsi="Montserrat"/>
-          <w:sz w:val="24"/>
-          <w:szCs w:val="24"/>
-          <w:highlight w:val="yellow"/>
-          <w:rtl w:val="0"/>
-        </w:rPr>
-        <w:t xml:space="preserve">{{ cidade_rep }}</w:t>
-      </w:r>
-      <w:r>
-        <w:rPr>
-          <w:rFonts w:ascii="Montserrat" w:cs="Montserrat" w:eastAsia="Montserrat" w:hAnsi="Montserrat"/>
-          <w:sz w:val="24"/>
-          <w:szCs w:val="24"/>
-          <w:rtl w:val="0"/>
-        </w:rPr>
-        <w:t xml:space="preserve"> - </w:t>
-      </w:r>
-      <w:r>
-        <w:rPr>
-          <w:rFonts w:ascii="Montserrat" w:cs="Montserrat" w:eastAsia="Montserrat" w:hAnsi="Montserrat"/>
-          <w:sz w:val="24"/>
-          <w:szCs w:val="24"/>
-          <w:highlight w:val="yellow"/>
-          <w:rtl w:val="0"/>
-        </w:rPr>
-        <w:t xml:space="preserve">{{ estado_rep }}</w:t>
-      </w:r>
-      <w:r>
-        <w:rPr>
-          <w:rFonts w:ascii="Montserrat" w:cs="Montserrat" w:eastAsia="Montserrat" w:hAnsi="Montserrat"/>
-          <w:sz w:val="24"/>
-          <w:szCs w:val="24"/>
-          <w:rtl w:val="0"/>
-        </w:rPr>
-        <w:t xml:space="preserve">.</w:t>
+          <w:rtl w:val="0"/>
+        </w:rPr>
+        <w:t xml:space="preserve">{{ numero_rep }}, {{ complemento_rep }} - {{ bairro_rep }}. CEP: {{ cep_rep }}.  {{ cidade_rep }} - {{ estado_rep }}.</w:t>
       </w:r>
       <w:r>
         <w:rPr>
@@ -1465,7 +1319,6 @@
           <w:rFonts w:ascii="Montserrat" w:cs="Montserrat" w:eastAsia="Montserrat" w:hAnsi="Montserrat"/>
           <w:sz w:val="24"/>
           <w:szCs w:val="24"/>
-          <w:highlight w:val="yellow"/>
           <w:rtl w:val="0"/>
         </w:rPr>
         <w:t xml:space="preserve">{{ servico }}</w:t>
@@ -1966,7 +1819,6 @@
           <w:color w:val="ff0000"/>
           <w:sz w:val="24"/>
           <w:szCs w:val="24"/>
-          <w:highlight w:val="yellow"/>
         </w:rPr>
       </w:pPr>
       <w:r>
@@ -2603,7 +2455,6 @@
                 <w:bCs w:val="1"/>
                 <w:sz w:val="24"/>
                 <w:szCs w:val="24"/>
-                <w:highlight w:val="yellow"/>
               </w:rPr>
             </w:pPr>
             <w:r>
@@ -2613,7 +2464,6 @@
                 <w:bCs w:val="1"/>
                 <w:sz w:val="24"/>
                 <w:szCs w:val="24"/>
-                <w:highlight w:val="yellow"/>
                 <w:rtl w:val="0"/>
               </w:rPr>
               <w:t xml:space="preserve">{{ detalhes }}</w:t>
@@ -2930,7 +2780,6 @@
           <w:rFonts w:ascii="Montserrat" w:cs="Montserrat" w:eastAsia="Montserrat" w:hAnsi="Montserrat"/>
           <w:sz w:val="24"/>
           <w:szCs w:val="24"/>
-          <w:highlight w:val="yellow"/>
           <w:rtl w:val="0"/>
         </w:rPr>
         <w:t xml:space="preserve">{{ prazo_execucao }}</w:t>
@@ -3001,7 +2850,6 @@
           <w:rFonts w:ascii="Montserrat" w:cs="Montserrat" w:eastAsia="Montserrat" w:hAnsi="Montserrat"/>
           <w:sz w:val="24"/>
           <w:szCs w:val="24"/>
-          <w:highlight w:val="yellow"/>
           <w:rtl w:val="0"/>
         </w:rPr>
         <w:t xml:space="preserve">{{ tolerancia_atraso }}</w:t>
@@ -3472,38 +3320,9 @@
           <w:rFonts w:ascii="Montserrat" w:cs="Montserrat" w:eastAsia="Montserrat" w:hAnsi="Montserrat"/>
           <w:sz w:val="24"/>
           <w:szCs w:val="24"/>
-          <w:highlight w:val="yellow"/>
-          <w:rtl w:val="0"/>
-        </w:rPr>
-        <w:t xml:space="preserve">{{ valor }}</w:t>
-      </w:r>
-      <w:r>
-        <w:rPr>
-          <w:rFonts w:ascii="Montserrat" w:cs="Montserrat" w:eastAsia="Montserrat" w:hAnsi="Montserrat"/>
-          <w:sz w:val="24"/>
-          <w:szCs w:val="24"/>
-          <w:rtl w:val="0"/>
-        </w:rPr>
-        <w:t xml:space="preserve"> (</w:t>
-      </w:r>
-      <w:r>
-        <w:rPr>
-          <w:rFonts w:ascii="Montserrat" w:cs="Montserrat" w:eastAsia="Montserrat" w:hAnsi="Montserrat"/>
-          <w:sz w:val="24"/>
-          <w:szCs w:val="24"/>
-          <w:highlight w:val="yellow"/>
-          <w:rtl w:val="0"/>
-        </w:rPr>
-        <w:t xml:space="preserve">{{ valor_extenso }}</w:t>
-      </w:r>
-      <w:r>
-        <w:rPr>
-          <w:rFonts w:ascii="Montserrat" w:cs="Montserrat" w:eastAsia="Montserrat" w:hAnsi="Montserrat"/>
-          <w:sz w:val="24"/>
-          <w:szCs w:val="24"/>
-          <w:rtl w:val="0"/>
-        </w:rPr>
-        <w:t xml:space="preserve">)</w:t>
+          <w:rtl w:val="0"/>
+        </w:rPr>
+        <w:t xml:space="preserve">{{ valor }} ({{ valor_extenso }})</w:t>
       </w:r>
       <w:r>
         <w:rPr>
@@ -3828,38 +3647,9 @@
           <w:rFonts w:ascii="Montserrat" w:cs="Montserrat" w:eastAsia="Montserrat" w:hAnsi="Montserrat"/>
           <w:sz w:val="24"/>
           <w:szCs w:val="24"/>
-          <w:highlight w:val="yellow"/>
-          <w:rtl w:val="0"/>
-        </w:rPr>
-        <w:t xml:space="preserve">{{ valor_entrada }}</w:t>
-      </w:r>
-      <w:r>
-        <w:rPr>
-          <w:rFonts w:ascii="Montserrat" w:cs="Montserrat" w:eastAsia="Montserrat" w:hAnsi="Montserrat"/>
-          <w:sz w:val="24"/>
-          <w:szCs w:val="24"/>
-          <w:rtl w:val="0"/>
-        </w:rPr>
-        <w:t xml:space="preserve"> (</w:t>
-      </w:r>
-      <w:r>
-        <w:rPr>
-          <w:rFonts w:ascii="Montserrat" w:cs="Montserrat" w:eastAsia="Montserrat" w:hAnsi="Montserrat"/>
-          <w:sz w:val="24"/>
-          <w:szCs w:val="24"/>
-          <w:highlight w:val="yellow"/>
-          <w:rtl w:val="0"/>
-        </w:rPr>
-        <w:t xml:space="preserve">{{ valor_entrada_extenso }}</w:t>
-      </w:r>
-      <w:r>
-        <w:rPr>
-          <w:rFonts w:ascii="Montserrat" w:cs="Montserrat" w:eastAsia="Montserrat" w:hAnsi="Montserrat"/>
-          <w:sz w:val="24"/>
-          <w:szCs w:val="24"/>
-          <w:rtl w:val="0"/>
-        </w:rPr>
-        <w:t xml:space="preserve">)</w:t>
+          <w:rtl w:val="0"/>
+        </w:rPr>
+        <w:t xml:space="preserve">{{ valor_entrada }} ({{ valor_entrada_extenso }})</w:t>
       </w:r>
       <w:r>
         <w:rPr>
@@ -6189,19 +5979,9 @@
           <w:rFonts w:ascii="Montserrat" w:cs="Montserrat" w:eastAsia="Montserrat" w:hAnsi="Montserrat"/>
           <w:sz w:val="24"/>
           <w:szCs w:val="24"/>
-          <w:highlight w:val="yellow"/>
-          <w:rtl w:val="0"/>
-        </w:rPr>
-        <w:t xml:space="preserve">{{ dia }}</w:t>
-      </w:r>
-      <w:r>
-        <w:rPr>
-          <w:rFonts w:ascii="Montserrat" w:cs="Montserrat" w:eastAsia="Montserrat" w:hAnsi="Montserrat"/>
-          <w:sz w:val="24"/>
-          <w:szCs w:val="24"/>
-          <w:rtl w:val="0"/>
-        </w:rPr>
-        <w:t xml:space="preserve"> </w:t>
+          <w:rtl w:val="0"/>
+        </w:rPr>
+        <w:t xml:space="preserve">{{ dia }} </w:t>
       </w:r>
       <w:r>
         <w:rPr>
@@ -6217,7 +5997,6 @@
           <w:rFonts w:ascii="Montserrat" w:cs="Montserrat" w:eastAsia="Montserrat" w:hAnsi="Montserrat"/>
           <w:sz w:val="24"/>
           <w:szCs w:val="24"/>
-          <w:highlight w:val="yellow"/>
           <w:rtl w:val="0"/>
         </w:rPr>
         <w:t xml:space="preserve">{{ mes }}</w:t>
@@ -6236,19 +6015,9 @@
           <w:rFonts w:ascii="Montserrat" w:cs="Montserrat" w:eastAsia="Montserrat" w:hAnsi="Montserrat"/>
           <w:sz w:val="24"/>
           <w:szCs w:val="24"/>
-          <w:highlight w:val="yellow"/>
-          <w:rtl w:val="0"/>
-        </w:rPr>
-        <w:t xml:space="preserve">{{ ano }}</w:t>
-      </w:r>
-      <w:r>
-        <w:rPr>
-          <w:rFonts w:ascii="Montserrat" w:cs="Montserrat" w:eastAsia="Montserrat" w:hAnsi="Montserrat"/>
-          <w:sz w:val="24"/>
-          <w:szCs w:val="24"/>
-          <w:rtl w:val="0"/>
-        </w:rPr>
-        <w:t xml:space="preserve">.</w:t>
+          <w:rtl w:val="0"/>
+        </w:rPr>
+        <w:t xml:space="preserve">{{ ano }}.</w:t>
       </w:r>
     </w:p>
     <w:p>
@@ -6340,15 +6109,13 @@
           <w:rFonts w:ascii="Montserrat" w:cs="Montserrat" w:eastAsia="Montserrat" w:hAnsi="Montserrat"/>
           <w:sz w:val="24"/>
           <w:szCs w:val="24"/>
-          <w:highlight w:val="yellow"/>
-        </w:rPr>
-      </w:pPr>
-      <w:r>
-        <w:rPr>
-          <w:rFonts w:ascii="Montserrat" w:cs="Montserrat" w:eastAsia="Montserrat" w:hAnsi="Montserrat"/>
-          <w:sz w:val="24"/>
-          <w:szCs w:val="24"/>
-          <w:highlight w:val="yellow"/>
+        </w:rPr>
+      </w:pPr>
+      <w:r>
+        <w:rPr>
+          <w:rFonts w:ascii="Montserrat" w:cs="Montserrat" w:eastAsia="Montserrat" w:hAnsi="Montserrat"/>
+          <w:sz w:val="24"/>
+          <w:szCs w:val="24"/>
           <w:rtl w:val="0"/>
         </w:rPr>
         <w:t xml:space="preserve">{{ nome_rep }}</w:t>
@@ -6364,7 +6131,6 @@
           <w:bCs w:val="1"/>
           <w:sz w:val="24"/>
           <w:szCs w:val="24"/>
-          <w:highlight w:val="yellow"/>
         </w:rPr>
       </w:pPr>
       <w:r>
@@ -6386,7 +6152,6 @@
           <w:bCs w:val="1"/>
           <w:sz w:val="24"/>
           <w:szCs w:val="24"/>
-          <w:highlight w:val="yellow"/>
           <w:rtl w:val="0"/>
         </w:rPr>
         <w:t xml:space="preserve">{{ cargo_rep }}</w:t>
@@ -6419,7 +6184,6 @@
           <w:bCs w:val="1"/>
           <w:sz w:val="24"/>
           <w:szCs w:val="24"/>
-          <w:highlight w:val="yellow"/>
         </w:rPr>
       </w:pPr>
       <w:r>
@@ -6438,7 +6202,6 @@
           <w:bCs w:val="1"/>
           <w:sz w:val="24"/>
           <w:szCs w:val="24"/>
-          <w:highlight w:val="yellow"/>
         </w:rPr>
       </w:pPr>
       <w:r>
@@ -6457,7 +6220,6 @@
           <w:bCs w:val="1"/>
           <w:sz w:val="24"/>
           <w:szCs w:val="24"/>
-          <w:highlight w:val="yellow"/>
         </w:rPr>
       </w:pPr>
       <w:r>
@@ -6518,15 +6280,13 @@
           <w:rFonts w:ascii="Montserrat" w:cs="Montserrat" w:eastAsia="Montserrat" w:hAnsi="Montserrat"/>
           <w:sz w:val="24"/>
           <w:szCs w:val="24"/>
-          <w:highlight w:val="yellow"/>
-        </w:rPr>
-      </w:pPr>
-      <w:r>
-        <w:rPr>
-          <w:rFonts w:ascii="Montserrat" w:cs="Montserrat" w:eastAsia="Montserrat" w:hAnsi="Montserrat"/>
-          <w:sz w:val="24"/>
-          <w:szCs w:val="24"/>
-          <w:highlight w:val="yellow"/>
+        </w:rPr>
+      </w:pPr>
+      <w:r>
+        <w:rPr>
+          <w:rFonts w:ascii="Montserrat" w:cs="Montserrat" w:eastAsia="Montserrat" w:hAnsi="Montserrat"/>
+          <w:sz w:val="24"/>
+          <w:szCs w:val="24"/>
           <w:rtl w:val="0"/>
         </w:rPr>
         <w:t xml:space="preserve">{{ atual_presidente }}</w:t>
@@ -6692,15 +6452,13 @@
           <w:rFonts w:ascii="Montserrat" w:cs="Montserrat" w:eastAsia="Montserrat" w:hAnsi="Montserrat"/>
           <w:sz w:val="24"/>
           <w:szCs w:val="24"/>
-          <w:highlight w:val="yellow"/>
-        </w:rPr>
-      </w:pPr>
-      <w:r>
-        <w:rPr>
-          <w:rFonts w:ascii="Montserrat" w:cs="Montserrat" w:eastAsia="Montserrat" w:hAnsi="Montserrat"/>
-          <w:sz w:val="24"/>
-          <w:szCs w:val="24"/>
-          <w:highlight w:val="yellow"/>
+        </w:rPr>
+      </w:pPr>
+      <w:r>
+        <w:rPr>
+          <w:rFonts w:ascii="Montserrat" w:cs="Montserrat" w:eastAsia="Montserrat" w:hAnsi="Montserrat"/>
+          <w:sz w:val="24"/>
+          <w:szCs w:val="24"/>
           <w:rtl w:val="0"/>
         </w:rPr>
         <w:t xml:space="preserve">{{ testemunha_1 }}</w:t>
@@ -6716,15 +6474,13 @@
           <w:bCs w:val="1"/>
           <w:sz w:val="24"/>
           <w:szCs w:val="24"/>
-          <w:highlight w:val="yellow"/>
-        </w:rPr>
-      </w:pPr>
-      <w:r>
-        <w:rPr>
-          <w:rFonts w:ascii="Montserrat" w:cs="Montserrat" w:eastAsia="Montserrat" w:hAnsi="Montserrat"/>
-          <w:sz w:val="24"/>
-          <w:szCs w:val="24"/>
-          <w:highlight w:val="yellow"/>
+        </w:rPr>
+      </w:pPr>
+      <w:r>
+        <w:rPr>
+          <w:rFonts w:ascii="Montserrat" w:cs="Montserrat" w:eastAsia="Montserrat" w:hAnsi="Montserrat"/>
+          <w:sz w:val="24"/>
+          <w:szCs w:val="24"/>
           <w:rtl w:val="0"/>
         </w:rPr>
         <w:t xml:space="preserve">{{ testemunha_1_cpf }}</w:t>
@@ -6823,15 +6579,13 @@
           <w:rFonts w:ascii="Montserrat" w:cs="Montserrat" w:eastAsia="Montserrat" w:hAnsi="Montserrat"/>
           <w:sz w:val="24"/>
           <w:szCs w:val="24"/>
-          <w:highlight w:val="yellow"/>
-        </w:rPr>
-      </w:pPr>
-      <w:r>
-        <w:rPr>
-          <w:rFonts w:ascii="Montserrat" w:cs="Montserrat" w:eastAsia="Montserrat" w:hAnsi="Montserrat"/>
-          <w:sz w:val="24"/>
-          <w:szCs w:val="24"/>
-          <w:highlight w:val="yellow"/>
+        </w:rPr>
+      </w:pPr>
+      <w:r>
+        <w:rPr>
+          <w:rFonts w:ascii="Montserrat" w:cs="Montserrat" w:eastAsia="Montserrat" w:hAnsi="Montserrat"/>
+          <w:sz w:val="24"/>
+          <w:szCs w:val="24"/>
           <w:rtl w:val="0"/>
         </w:rPr>
         <w:t xml:space="preserve">{{ testemunha_2 }}</w:t>
@@ -6847,15 +6601,13 @@
           <w:bCs w:val="1"/>
           <w:sz w:val="24"/>
           <w:szCs w:val="24"/>
-          <w:highlight w:val="yellow"/>
-        </w:rPr>
-      </w:pPr>
-      <w:r>
-        <w:rPr>
-          <w:rFonts w:ascii="Montserrat" w:cs="Montserrat" w:eastAsia="Montserrat" w:hAnsi="Montserrat"/>
-          <w:sz w:val="24"/>
-          <w:szCs w:val="24"/>
-          <w:highlight w:val="yellow"/>
+        </w:rPr>
+      </w:pPr>
+      <w:r>
+        <w:rPr>
+          <w:rFonts w:ascii="Montserrat" w:cs="Montserrat" w:eastAsia="Montserrat" w:hAnsi="Montserrat"/>
+          <w:sz w:val="24"/>
+          <w:szCs w:val="24"/>
           <w:rtl w:val="0"/>
         </w:rPr>
         <w:t xml:space="preserve">{{ testemunha_2_cpf }}</w:t>
@@ -6996,12 +6748,12 @@
               <wp:extent cx="1906905" cy="581025"/>
               <wp:effectExtent b="0" l="0" r="0" t="0"/>
               <wp:wrapNone/>
-              <wp:docPr id="1" name="image5.png"/>
+              <wp:docPr id="1" name="image3.png"/>
               <a:graphic>
                 <a:graphicData uri="http://schemas.openxmlformats.org/drawingml/2006/picture">
                   <pic:pic>
                     <pic:nvPicPr>
-                      <pic:cNvPr id="0" name="image5.png"/>
+                      <pic:cNvPr id="0" name="image3.png"/>
                       <pic:cNvPicPr preferRelativeResize="0"/>
                     </pic:nvPicPr>
                     <pic:blipFill>
@@ -7040,12 +6792,12 @@
           <wp:extent cx="7879229" cy="1009650"/>
           <wp:effectExtent b="0" l="0" r="0" t="0"/>
           <wp:wrapNone/>
-          <wp:docPr id="3" name="image1.png"/>
+          <wp:docPr id="3" name="image4.png"/>
           <a:graphic>
             <a:graphicData uri="http://schemas.openxmlformats.org/drawingml/2006/picture">
               <pic:pic>
                 <pic:nvPicPr>
-                  <pic:cNvPr id="0" name="image1.png"/>
+                  <pic:cNvPr id="0" name="image4.png"/>
                   <pic:cNvPicPr preferRelativeResize="0"/>
                 </pic:nvPicPr>
                 <pic:blipFill>
@@ -7210,7 +6962,7 @@
       <w:rPr/>
       <w:pict>
         <v:shape id="WordPictureWatermark2" style="position:absolute;width:850.3937007874017pt;height:669.5111138056734pt;rotation:0;z-index:-503316481;mso-position-horizontal-relative:margin;mso-position-horizontal:center;mso-position-vertical-relative:margin;mso-position-vertical:center;" alt="" type="#_x0000_t75">
-          <v:imagedata cropbottom="0f" cropleft="0f" cropright="0f" croptop="0f" r:id="rId1" o:title="image3.png"/>
+          <v:imagedata cropbottom="0f" cropleft="0f" cropright="0f" croptop="0f" r:id="rId1" o:title="image2.png"/>
         </v:shape>
       </w:pict>
     </w:r>
@@ -7228,12 +6980,12 @@
           <wp:extent cx="1030605" cy="1013460"/>
           <wp:effectExtent b="0" l="0" r="0" t="0"/>
           <wp:wrapSquare wrapText="bothSides" distB="0" distT="0" distL="114300" distR="114300"/>
-          <wp:docPr id="2" name="image4.png"/>
+          <wp:docPr id="2" name="image5.png"/>
           <a:graphic>
             <a:graphicData uri="http://schemas.openxmlformats.org/drawingml/2006/picture">
               <pic:pic>
                 <pic:nvPicPr>
-                  <pic:cNvPr id="0" name="image4.png"/>
+                  <pic:cNvPr id="0" name="image5.png"/>
                   <pic:cNvPicPr preferRelativeResize="0"/>
                 </pic:nvPicPr>
                 <pic:blipFill>
@@ -7308,7 +7060,7 @@
       <w:rPr/>
       <w:pict>
         <v:shape id="WordPictureWatermark1" style="position:absolute;width:850.3937007874017pt;height:669.5111138056734pt;rotation:0;z-index:-503316481;mso-position-horizontal-relative:margin;mso-position-horizontal:center;mso-position-vertical-relative:margin;mso-position-vertical:center;" alt="" type="#_x0000_t75">
-          <v:imagedata cropbottom="0f" cropleft="0f" cropright="0f" croptop="0f" r:id="rId1" o:title="image3.png"/>
+          <v:imagedata cropbottom="0f" cropleft="0f" cropright="0f" croptop="0f" r:id="rId1" o:title="image2.png"/>
         </v:shape>
       </w:pict>
     </w:r>
@@ -7363,7 +7115,7 @@
       <w:rPr/>
       <w:pict>
         <v:shape id="WordPictureWatermark3" style="position:absolute;width:850.3937007874017pt;height:669.5111138056734pt;rotation:0;z-index:-503316481;mso-position-horizontal-relative:margin;mso-position-horizontal:center;mso-position-vertical-relative:margin;mso-position-vertical:center;" alt="" type="#_x0000_t75">
-          <v:imagedata cropbottom="0f" cropleft="0f" cropright="0f" croptop="0f" r:id="rId1" o:title="image3.png"/>
+          <v:imagedata cropbottom="0f" cropleft="0f" cropright="0f" croptop="0f" r:id="rId1" o:title="image2.png"/>
         </v:shape>
       </w:pict>
     </w:r>

</xml_diff>